<commit_message>
Modified exportLembarPenilaian on SeminarController, modified form penilaian kolokium, added form penilaian seminar
</commit_message>
<xml_diff>
--- a/storage/app/templates/formulir_lembar_penilaian_kolokium.docx
+++ b/storage/app/templates/formulir_lembar_penilaian_kolokium.docx
@@ -908,13 +908,13 @@
       <w:pPr>
         <w:tabs>
           <w:tab w:val="left" w:pos="3960"/>
-          <w:tab w:val="left" w:pos="4230"/>
+          <w:tab w:val="left" w:pos="4253"/>
         </w:tabs>
         <w:autoSpaceDE w:val="0"/>
         <w:autoSpaceDN w:val="0"/>
         <w:adjustRightInd w:val="0"/>
         <w:spacing w:after="0" w:line="240" w:lineRule="auto"/>
-        <w:ind w:left="4230" w:hanging="2954"/>
+        <w:ind w:left="4253" w:hanging="2977"/>
         <w:rPr>
           <w:rFonts w:ascii="Times New Roman" w:hAnsi="Times New Roman"/>
           <w:sz w:val="24"/>
@@ -2546,13 +2546,13 @@
       <w:pPr>
         <w:tabs>
           <w:tab w:val="left" w:pos="3969"/>
-          <w:tab w:val="left" w:pos="4230"/>
+          <w:tab w:val="left" w:pos="4253"/>
         </w:tabs>
         <w:autoSpaceDE w:val="0"/>
         <w:autoSpaceDN w:val="0"/>
         <w:adjustRightInd w:val="0"/>
         <w:spacing w:after="0" w:line="240" w:lineRule="auto"/>
-        <w:ind w:left="4230" w:hanging="2954"/>
+        <w:ind w:left="4253" w:hanging="2977"/>
         <w:rPr>
           <w:rFonts w:ascii="Times New Roman" w:hAnsi="Times New Roman"/>
           <w:sz w:val="24"/>
@@ -4245,13 +4245,12 @@
       <w:pPr>
         <w:tabs>
           <w:tab w:val="left" w:pos="3960"/>
-          <w:tab w:val="left" w:pos="4230"/>
         </w:tabs>
         <w:autoSpaceDE w:val="0"/>
         <w:autoSpaceDN w:val="0"/>
         <w:adjustRightInd w:val="0"/>
         <w:spacing w:after="0" w:line="240" w:lineRule="auto"/>
-        <w:ind w:left="4230" w:hanging="2954"/>
+        <w:ind w:left="4253" w:hanging="2977"/>
         <w:rPr>
           <w:rFonts w:ascii="Times New Roman" w:hAnsi="Times New Roman"/>
           <w:sz w:val="24"/>
@@ -5286,7 +5285,7 @@
     <w:rPrDefault>
       <w:rPr>
         <w:rFonts w:ascii="Calibri" w:eastAsia="Calibri" w:hAnsi="Calibri" w:cs="Times New Roman"/>
-        <w:lang w:val="en-US" w:eastAsia="en-US" w:bidi="ar-SA"/>
+        <w:lang w:val="en-ID" w:eastAsia="en-ID" w:bidi="ar-SA"/>
       </w:rPr>
     </w:rPrDefault>
     <w:pPrDefault/>
@@ -5679,16 +5678,16 @@
     <w:rPr>
       <w:sz w:val="22"/>
       <w:szCs w:val="22"/>
-      <w:lang w:val="id-ID"/>
+      <w:lang w:val="id-ID" w:eastAsia="en-US"/>
     </w:rPr>
   </w:style>
-  <w:style w:type="character" w:default="1" w:styleId="FontParagrafDefault">
+  <w:style w:type="character" w:default="1" w:styleId="DefaultParagraphFont">
     <w:name w:val="Default Paragraph Font"/>
     <w:uiPriority w:val="1"/>
     <w:semiHidden/>
     <w:unhideWhenUsed/>
   </w:style>
-  <w:style w:type="table" w:default="1" w:styleId="TabelNormal">
+  <w:style w:type="table" w:default="1" w:styleId="TableNormal">
     <w:name w:val="Normal Table"/>
     <w:uiPriority w:val="99"/>
     <w:semiHidden/>
@@ -5703,13 +5702,13 @@
       </w:tblCellMar>
     </w:tblPr>
   </w:style>
-  <w:style w:type="numbering" w:default="1" w:styleId="TidakAdaDaftar">
+  <w:style w:type="numbering" w:default="1" w:styleId="NoList">
     <w:name w:val="No List"/>
     <w:uiPriority w:val="99"/>
     <w:semiHidden/>
     <w:unhideWhenUsed/>
   </w:style>
-  <w:style w:type="paragraph" w:styleId="DaftarParagraf">
+  <w:style w:type="paragraph" w:styleId="ListParagraph">
     <w:name w:val="List Paragraph"/>
     <w:basedOn w:val="Normal"/>
     <w:uiPriority w:val="34"/>
@@ -5730,10 +5729,10 @@
       <w:u w:val="single"/>
     </w:rPr>
   </w:style>
-  <w:style w:type="paragraph" w:styleId="TeksBalon">
+  <w:style w:type="paragraph" w:styleId="BalloonText">
     <w:name w:val="Balloon Text"/>
     <w:basedOn w:val="Normal"/>
-    <w:link w:val="TeksBalonKAR"/>
+    <w:link w:val="BalloonTextChar"/>
     <w:uiPriority w:val="99"/>
     <w:semiHidden/>
     <w:unhideWhenUsed/>
@@ -5747,9 +5746,9 @@
       <w:szCs w:val="16"/>
     </w:rPr>
   </w:style>
-  <w:style w:type="character" w:customStyle="1" w:styleId="TeksBalonKAR">
-    <w:name w:val="Teks Balon KAR"/>
-    <w:link w:val="TeksBalon"/>
+  <w:style w:type="character" w:customStyle="1" w:styleId="BalloonTextChar">
+    <w:name w:val="Balloon Text Char"/>
+    <w:link w:val="BalloonText"/>
     <w:uiPriority w:val="99"/>
     <w:semiHidden/>
     <w:rsid w:val="007731F1"/>
@@ -5759,7 +5758,7 @@
       <w:szCs w:val="16"/>
     </w:rPr>
   </w:style>
-  <w:style w:type="paragraph" w:styleId="TidakAdaSpasi">
+  <w:style w:type="paragraph" w:styleId="NoSpacing">
     <w:name w:val="No Spacing"/>
     <w:uiPriority w:val="1"/>
     <w:qFormat/>
@@ -5767,7 +5766,7 @@
     <w:rPr>
       <w:sz w:val="22"/>
       <w:szCs w:val="22"/>
-      <w:lang w:val="id-ID"/>
+      <w:lang w:val="id-ID" w:eastAsia="en-US"/>
     </w:rPr>
   </w:style>
 </w:styles>

</xml_diff>